<commit_message>
3.A.8: tablas de Slutsky con color, como en el tema antiguo; salto de página antes de los anexos
- Tablas de la ecuación de Slutsky (propia y cruzada) con la fila de la
  ecuación en salvia, banda de título en azul o salmón, celdas combinadas y
  cada categoría en su color.
- construir-tema.py y tcee.lua pasan a la web y a Word las celdas
  combinadas (\multirow), los saltos de línea, los fondos y el texto en
  color de las tablas, y las notas bajo las tablas (antes se perdían).
- HTML sin cortes de línea (MathJax se comía espacios en \text{}); Word sin
  ecuaciones rotas por \autor dentro de \text; verificar-tema lo comprueba.
- Salto de página tras la conclusión (antes de los anexos) en lugar de tras
  la introducción; criterios y agente editor actualizados.

Co-Authored-By: Claude Opus 5.5 <noreply@anthropic.com>
Claude-Session: https://claude.ai/code/session_015dNTYMnYeuZSNPwTVPoXNf
</commit_message>
<xml_diff>
--- a/oposicion/temario/latex/reference.docx
+++ b/oposicion/temario/latex/reference.docx
@@ -1234,6 +1234,14 @@
         <w:bottom w:w="0" w:type="dxa"/>
         <w:right w:w="108" w:type="dxa"/>
       </w:tblCellMar>
+      <w:tblBorders>
+        <w:top w:val="single" w:sz="4" w:color="A6A6A6"/>
+        <w:left w:val="single" w:sz="4" w:color="A6A6A6"/>
+        <w:bottom w:val="single" w:sz="4" w:color="A6A6A6"/>
+        <w:right w:val="single" w:sz="4" w:color="A6A6A6"/>
+        <w:insideH w:val="single" w:sz="4" w:color="A6A6A6"/>
+        <w:insideV w:val="single" w:sz="4" w:color="A6A6A6"/>
+      </w:tblBorders>
     </w:tblPr>
     <w:tblStylePr w:type="firstRow">
       <w:tblPr>
@@ -1468,6 +1476,98 @@
     <w:name w:val="Referencia a tema"/>
     <w:rPr>
       <w:color w:val="767171"/>
+    </w:rPr>
+  </w:style>
+  <w:style w:type="paragraph" w:customStyle="1" w:styleId="Celdatceesalvia">
+    <w:name w:val="Celda tceesalvia"/>
+    <w:basedOn w:val="Normal"/>
+    <w:qFormat/>
+    <w:pPr>
+      <w:spacing w:after="0"/>
+      <w:jc w:val="center"/>
+      <w:shd w:val="clear" w:color="auto" w:fill="E2EFD9"/>
+    </w:pPr>
+    <w:rPr>
+      <w:rFonts w:ascii="Palatino Linotype" w:hAnsi="Palatino Linotype" w:cs="Palatino Linotype" w:eastAsia="Palatino Linotype"/>
+      <w:sz w:val="20"/>
+    </w:rPr>
+  </w:style>
+  <w:style w:type="paragraph" w:customStyle="1" w:styleId="Celdatceeazulpalido">
+    <w:name w:val="Celda tceeazulpalido"/>
+    <w:basedOn w:val="Normal"/>
+    <w:qFormat/>
+    <w:pPr>
+      <w:spacing w:after="0"/>
+      <w:jc w:val="center"/>
+      <w:shd w:val="clear" w:color="auto" w:fill="DDEBF7"/>
+    </w:pPr>
+    <w:rPr>
+      <w:rFonts w:ascii="Palatino Linotype" w:hAnsi="Palatino Linotype" w:cs="Palatino Linotype" w:eastAsia="Palatino Linotype"/>
+      <w:sz w:val="20"/>
+    </w:rPr>
+  </w:style>
+  <w:style w:type="paragraph" w:customStyle="1" w:styleId="Celdatceesalmon">
+    <w:name w:val="Celda tceesalmon"/>
+    <w:basedOn w:val="Normal"/>
+    <w:qFormat/>
+    <w:pPr>
+      <w:spacing w:after="0"/>
+      <w:jc w:val="center"/>
+      <w:shd w:val="clear" w:color="auto" w:fill="FBE4D5"/>
+    </w:pPr>
+    <w:rPr>
+      <w:rFonts w:ascii="Palatino Linotype" w:hAnsi="Palatino Linotype" w:cs="Palatino Linotype" w:eastAsia="Palatino Linotype"/>
+      <w:sz w:val="20"/>
+    </w:rPr>
+  </w:style>
+  <w:style w:type="paragraph" w:customStyle="1" w:styleId="Celdatceemoradopalido">
+    <w:name w:val="Celda tceemoradopalido"/>
+    <w:basedOn w:val="Normal"/>
+    <w:qFormat/>
+    <w:pPr>
+      <w:spacing w:after="0"/>
+      <w:jc w:val="center"/>
+      <w:shd w:val="clear" w:color="auto" w:fill="F3EEF7"/>
+    </w:pPr>
+    <w:rPr>
+      <w:rFonts w:ascii="Palatino Linotype" w:hAnsi="Palatino Linotype" w:cs="Palatino Linotype" w:eastAsia="Palatino Linotype"/>
+      <w:sz w:val="20"/>
+    </w:rPr>
+  </w:style>
+  <w:style w:type="character" w:customStyle="1" w:styleId="Textomorado">
+    <w:name w:val="Texto morado"/>
+    <w:rPr>
+      <w:color w:val="5F2987"/>
+    </w:rPr>
+  </w:style>
+  <w:style w:type="character" w:customStyle="1" w:styleId="Textoverde">
+    <w:name w:val="Texto verde"/>
+    <w:rPr>
+      <w:color w:val="2E8B3A"/>
+    </w:rPr>
+  </w:style>
+  <w:style w:type="character" w:customStyle="1" w:styleId="Textoazul">
+    <w:name w:val="Texto azul"/>
+    <w:rPr>
+      <w:color w:val="1C8FC9"/>
+    </w:rPr>
+  </w:style>
+  <w:style w:type="character" w:customStyle="1" w:styleId="Textonaranja">
+    <w:name w:val="Texto naranja"/>
+    <w:rPr>
+      <w:color w:val="E07B28"/>
+    </w:rPr>
+  </w:style>
+  <w:style w:type="character" w:customStyle="1" w:styleId="Textorojo">
+    <w:name w:val="Texto rojo"/>
+    <w:rPr>
+      <w:color w:val="D11F1F"/>
+    </w:rPr>
+  </w:style>
+  <w:style w:type="character" w:customStyle="1" w:styleId="Textodorado">
+    <w:name w:val="Texto dorado"/>
+    <w:rPr>
+      <w:color w:val="B8860B"/>
     </w:rPr>
   </w:style>
 </w:styles>

</xml_diff>

<commit_message>
3.A.8: vídeo con rejilla flexible, escritura a mano trazo a trazo y esquema que avanza; voz clonada; 3D en perspectiva caballera; notación única de la preferencia revelada; sin líneas viudas ni huérfanas
Co-Authored-By: Claude Opus 5.5 <noreply@anthropic.com>
Claude-Session: https://claude.ai/code/session_015dNTYMnYeuZSNPwTVPoXNf
</commit_message>
<xml_diff>
--- a/oposicion/temario/latex/reference.docx
+++ b/oposicion/temario/latex/reference.docx
@@ -632,6 +632,7 @@
     <w:name w:val="Normal"/>
     <w:qFormat/>
     <w:pPr>
+      <w:widowControl/>
       <w:spacing w:after="120"/>
       <w:jc w:val="both"/>
     </w:pPr>
@@ -646,6 +647,7 @@
     <w:link w:val="BodyTextChar"/>
     <w:qFormat/>
     <w:pPr>
+      <w:widowControl/>
       <w:spacing w:before="180" w:after="120"/>
       <w:jc w:val="both"/>
     </w:pPr>
@@ -660,6 +662,7 @@
     <w:next w:val="BodyText"/>
     <w:qFormat/>
     <w:pPr>
+      <w:widowControl/>
       <w:spacing w:after="120"/>
       <w:jc w:val="both"/>
     </w:pPr>
@@ -673,6 +676,7 @@
     <w:basedOn w:val="BodyText"/>
     <w:qFormat/>
     <w:pPr>
+      <w:widowControl/>
       <w:spacing w:before="36" w:after="40"/>
       <w:jc w:val="both"/>
     </w:pPr>

</xml_diff>

<commit_message>
Tema 3.A.9 con los comentarios de Víctor (13/10/2026): ingredientes y esquema recuperados, propiedades punto por punto, h⃗ hicksiana y μ en el dual, Slutsky completo, tablas del 3.A.8 centradas y con colores del gráfico, bienestar paso a paso, cajas del IPC y deflactor; ficha de repaso; colores comunes, perspectiva 3D de Jehle-Reny y criterios nuevos
Co-Authored-By: Claude Opus 5.5 <noreply@anthropic.com>
Claude-Session: https://claude.ai/code/session_015dNTYMnYeuZSNPwTVPoXNf
</commit_message>
<xml_diff>
--- a/oposicion/temario/latex/reference.docx
+++ b/oposicion/temario/latex/reference.docx
@@ -1547,13 +1547,13 @@
   <w:style w:type="character" w:customStyle="1" w:styleId="Textoverde">
     <w:name w:val="Texto verde"/>
     <w:rPr>
-      <w:color w:val="2E8B3A"/>
+      <w:color w:val="3C7D3A"/>
     </w:rPr>
   </w:style>
   <w:style w:type="character" w:customStyle="1" w:styleId="Textoazul">
     <w:name w:val="Texto azul"/>
     <w:rPr>
-      <w:color w:val="1C8FC9"/>
+      <w:color w:val="1F5F99"/>
     </w:rPr>
   </w:style>
   <w:style w:type="character" w:customStyle="1" w:styleId="Textonaranja">
@@ -1565,7 +1565,7 @@
   <w:style w:type="character" w:customStyle="1" w:styleId="Textorojo">
     <w:name w:val="Texto rojo"/>
     <w:rPr>
-      <w:color w:val="D11F1F"/>
+      <w:color w:val="B22222"/>
     </w:rPr>
   </w:style>
   <w:style w:type="character" w:customStyle="1" w:styleId="Textodorado">

</xml_diff>

<commit_message>
Decisiones de Víctor del 19/10: marcadores numerados, Word en Pagella con Palatino de reserva, 3.A.16 con i) en \subparagraph, versiones anteriores sin indexar, fecha de publicación
- tcee.sty: marcadores del PDF con el número del apartado («I.1. …»; bookmark numbered).
- Word: TeX Gyre Pagella con Palatino Linotype como fuente de reserva (altName en la tabla de fuentes; reference.docx y construir-tema.py).
- 3.A.16: los nueve bloques i), ii), iii) pasan a \subparagraph (CRITERIOS §2).
- Los <tema>-anterior.pdf/.docx quedan fuera del sitemap, bloqueados en robots.txt y enlazados con rel="nofollow" (plantilla e índice).
- Página de cada tema: datePublished y citation_publication_date con la fecha de aprobación del tema (estado.json); dateModified con la de \tcefecha.
- Los siete temas revisados reconstruidos (mismas páginas y letra de ficha).

Co-Authored-By: Claude Fable 5.1 <noreply@anthropic.com>
Claude-Session: https://claude.ai/code/session_01U1qGW9Z1ES1hvR4ih98cS2
</commit_message>
<xml_diff>
--- a/oposicion/temario/latex/reference.docx
+++ b/oposicion/temario/latex/reference.docx
@@ -637,7 +637,7 @@
       <w:jc w:val="both"/>
     </w:pPr>
     <w:rPr>
-      <w:rFonts w:ascii="Palatino Linotype" w:hAnsi="Palatino Linotype" w:cs="Palatino Linotype" w:eastAsia="Palatino Linotype"/>
+      <w:rFonts w:ascii="TeX Gyre Pagella" w:hAnsi="TeX Gyre Pagella" w:cs="TeX Gyre Pagella" w:eastAsia="TeX Gyre Pagella"/>
       <w:sz w:val="22"/>
     </w:rPr>
   </w:style>
@@ -652,7 +652,7 @@
       <w:jc w:val="both"/>
     </w:pPr>
     <w:rPr>
-      <w:rFonts w:ascii="Palatino Linotype" w:hAnsi="Palatino Linotype" w:cs="Palatino Linotype" w:eastAsia="Palatino Linotype"/>
+      <w:rFonts w:ascii="TeX Gyre Pagella" w:hAnsi="TeX Gyre Pagella" w:cs="TeX Gyre Pagella" w:eastAsia="TeX Gyre Pagella"/>
       <w:sz w:val="22"/>
     </w:rPr>
   </w:style>
@@ -667,7 +667,7 @@
       <w:jc w:val="both"/>
     </w:pPr>
     <w:rPr>
-      <w:rFonts w:ascii="Palatino Linotype" w:hAnsi="Palatino Linotype" w:cs="Palatino Linotype" w:eastAsia="Palatino Linotype"/>
+      <w:rFonts w:ascii="TeX Gyre Pagella" w:hAnsi="TeX Gyre Pagella" w:cs="TeX Gyre Pagella" w:eastAsia="TeX Gyre Pagella"/>
       <w:sz w:val="22"/>
     </w:rPr>
   </w:style>
@@ -681,7 +681,7 @@
       <w:jc w:val="both"/>
     </w:pPr>
     <w:rPr>
-      <w:rFonts w:ascii="Palatino Linotype" w:hAnsi="Palatino Linotype" w:cs="Palatino Linotype" w:eastAsia="Palatino Linotype"/>
+      <w:rFonts w:ascii="TeX Gyre Pagella" w:hAnsi="TeX Gyre Pagella" w:cs="TeX Gyre Pagella" w:eastAsia="TeX Gyre Pagella"/>
       <w:sz w:val="22"/>
     </w:rPr>
   </w:style>
@@ -701,7 +701,7 @@
       <w:jc w:val="center"/>
     </w:pPr>
     <w:rPr>
-      <w:rFonts w:ascii="Palatino Linotype" w:hAnsi="Palatino Linotype" w:cs="Palatino Linotype" w:eastAsia="Palatino Linotype"/>
+      <w:rFonts w:ascii="TeX Gyre Pagella" w:hAnsi="TeX Gyre Pagella" w:cs="TeX Gyre Pagella" w:eastAsia="TeX Gyre Pagella"/>
       <w:b/>
       <w:caps/>
       <w:color w:val="5F2987"/>
@@ -736,7 +736,7 @@
       <w:jc w:val="center"/>
     </w:pPr>
     <w:rPr>
-      <w:rFonts w:ascii="Palatino Linotype" w:hAnsi="Palatino Linotype" w:cs="Palatino Linotype" w:eastAsia="Palatino Linotype"/>
+      <w:rFonts w:ascii="TeX Gyre Pagella" w:hAnsi="TeX Gyre Pagella" w:cs="TeX Gyre Pagella" w:eastAsia="TeX Gyre Pagella"/>
       <w:b w:val="0"/>
       <w:i/>
       <w:caps w:val="0"/>
@@ -771,7 +771,7 @@
       <w:jc w:val="center"/>
     </w:pPr>
     <w:rPr>
-      <w:rFonts w:ascii="Palatino Linotype" w:hAnsi="Palatino Linotype" w:cs="Palatino Linotype" w:eastAsia="Palatino Linotype"/>
+      <w:rFonts w:ascii="TeX Gyre Pagella" w:hAnsi="TeX Gyre Pagella" w:cs="TeX Gyre Pagella" w:eastAsia="TeX Gyre Pagella"/>
       <w:b w:val="0"/>
       <w:i/>
       <w:caps w:val="0"/>
@@ -792,7 +792,7 @@
       <w:jc w:val="center"/>
     </w:pPr>
     <w:rPr>
-      <w:rFonts w:ascii="Palatino Linotype" w:hAnsi="Palatino Linotype" w:cs="Palatino Linotype" w:eastAsia="Palatino Linotype"/>
+      <w:rFonts w:ascii="TeX Gyre Pagella" w:hAnsi="TeX Gyre Pagella" w:cs="TeX Gyre Pagella" w:eastAsia="TeX Gyre Pagella"/>
       <w:b w:val="0"/>
       <w:i/>
       <w:caps w:val="0"/>
@@ -840,7 +840,7 @@
     <w:qFormat/>
     <w:pPr/>
     <w:rPr>
-      <w:rFonts w:ascii="Palatino Linotype" w:hAnsi="Palatino Linotype" w:cs="Palatino Linotype" w:eastAsia="Palatino Linotype"/>
+      <w:rFonts w:ascii="TeX Gyre Pagella" w:hAnsi="TeX Gyre Pagella" w:cs="TeX Gyre Pagella" w:eastAsia="TeX Gyre Pagella"/>
       <w:sz w:val="20"/>
     </w:rPr>
   </w:style>
@@ -860,7 +860,7 @@
       <w:shd w:val="clear" w:color="auto" w:fill="5F2987"/>
     </w:pPr>
     <w:rPr>
-      <w:rFonts w:ascii="Palatino Linotype" w:hAnsi="Palatino Linotype" w:cs="Palatino Linotype" w:eastAsia="Palatino Linotype"/>
+      <w:rFonts w:ascii="TeX Gyre Pagella" w:hAnsi="TeX Gyre Pagella" w:cs="TeX Gyre Pagella" w:eastAsia="TeX Gyre Pagella"/>
       <w:b/>
       <w:caps/>
       <w:color w:val="FFFFFF"/>
@@ -888,7 +888,7 @@
       </w:pBdr>
     </w:pPr>
     <w:rPr>
-      <w:rFonts w:ascii="Palatino Linotype" w:hAnsi="Palatino Linotype" w:cs="Palatino Linotype" w:eastAsia="Palatino Linotype"/>
+      <w:rFonts w:ascii="TeX Gyre Pagella" w:hAnsi="TeX Gyre Pagella" w:cs="TeX Gyre Pagella" w:eastAsia="TeX Gyre Pagella"/>
       <w:b/>
       <w:caps w:val="0"/>
       <w:color w:val="5F2987"/>
@@ -914,7 +914,7 @@
       <w:outlineLvl w:val="2"/>
     </w:pPr>
     <w:rPr>
-      <w:rFonts w:ascii="Palatino Linotype" w:hAnsi="Palatino Linotype" w:cs="Palatino Linotype" w:eastAsia="Palatino Linotype"/>
+      <w:rFonts w:ascii="TeX Gyre Pagella" w:hAnsi="TeX Gyre Pagella" w:cs="TeX Gyre Pagella" w:eastAsia="TeX Gyre Pagella"/>
       <w:b w:val="0"/>
       <w:i/>
       <w:color w:val="5F2987"/>
@@ -940,7 +940,7 @@
       <w:outlineLvl w:val="3"/>
     </w:pPr>
     <w:rPr>
-      <w:rFonts w:ascii="Palatino Linotype" w:hAnsi="Palatino Linotype" w:cs="Palatino Linotype" w:eastAsia="Palatino Linotype"/>
+      <w:rFonts w:ascii="TeX Gyre Pagella" w:hAnsi="TeX Gyre Pagella" w:cs="TeX Gyre Pagella" w:eastAsia="TeX Gyre Pagella"/>
       <w:b w:val="0"/>
       <w:i/>
       <w:iCs/>
@@ -966,7 +966,7 @@
       <w:outlineLvl w:val="4"/>
     </w:pPr>
     <w:rPr>
-      <w:rFonts w:ascii="Palatino Linotype" w:hAnsi="Palatino Linotype" w:cs="Palatino Linotype" w:eastAsia="Palatino Linotype"/>
+      <w:rFonts w:ascii="TeX Gyre Pagella" w:hAnsi="TeX Gyre Pagella" w:cs="TeX Gyre Pagella" w:eastAsia="TeX Gyre Pagella"/>
       <w:b w:val="0"/>
       <w:i/>
       <w:color w:val="4A1F6B"/>
@@ -991,7 +991,7 @@
       <w:outlineLvl w:val="5"/>
     </w:pPr>
     <w:rPr>
-      <w:rFonts w:ascii="Palatino Linotype" w:hAnsi="Palatino Linotype" w:cs="Palatino Linotype" w:eastAsia="Palatino Linotype"/>
+      <w:rFonts w:ascii="TeX Gyre Pagella" w:hAnsi="TeX Gyre Pagella" w:cs="TeX Gyre Pagella" w:eastAsia="TeX Gyre Pagella"/>
       <w:b w:val="0"/>
       <w:i/>
       <w:iCs/>
@@ -1203,7 +1203,7 @@
     <w:unhideWhenUsed/>
     <w:qFormat/>
     <w:rPr>
-      <w:rFonts w:ascii="Palatino Linotype" w:hAnsi="Palatino Linotype" w:cs="Palatino Linotype" w:eastAsia="Palatino Linotype"/>
+      <w:rFonts w:ascii="TeX Gyre Pagella" w:hAnsi="TeX Gyre Pagella" w:cs="TeX Gyre Pagella" w:eastAsia="TeX Gyre Pagella"/>
       <w:sz w:val="18"/>
     </w:rPr>
   </w:style>
@@ -1290,7 +1290,7 @@
       <w:jc w:val="center"/>
     </w:pPr>
     <w:rPr>
-      <w:rFonts w:ascii="Palatino Linotype" w:hAnsi="Palatino Linotype" w:cs="Palatino Linotype" w:eastAsia="Palatino Linotype"/>
+      <w:rFonts w:ascii="TeX Gyre Pagella" w:hAnsi="TeX Gyre Pagella" w:cs="TeX Gyre Pagella" w:eastAsia="TeX Gyre Pagella"/>
       <w:b w:val="0"/>
       <w:i w:val="0"/>
       <w:color w:val="5F2987"/>
@@ -1305,7 +1305,7 @@
       <w:jc w:val="center"/>
     </w:pPr>
     <w:rPr>
-      <w:rFonts w:ascii="Palatino Linotype" w:hAnsi="Palatino Linotype" w:cs="Palatino Linotype" w:eastAsia="Palatino Linotype"/>
+      <w:rFonts w:ascii="TeX Gyre Pagella" w:hAnsi="TeX Gyre Pagella" w:cs="TeX Gyre Pagella" w:eastAsia="TeX Gyre Pagella"/>
       <w:b w:val="0"/>
       <w:i w:val="0"/>
       <w:color w:val="5F2987"/>
@@ -1320,7 +1320,7 @@
       <w:jc w:val="center"/>
     </w:pPr>
     <w:rPr>
-      <w:rFonts w:ascii="Palatino Linotype" w:hAnsi="Palatino Linotype" w:cs="Palatino Linotype" w:eastAsia="Palatino Linotype"/>
+      <w:rFonts w:ascii="TeX Gyre Pagella" w:hAnsi="TeX Gyre Pagella" w:cs="TeX Gyre Pagella" w:eastAsia="TeX Gyre Pagella"/>
       <w:b w:val="0"/>
       <w:i w:val="0"/>
       <w:color w:val="5F2987"/>
@@ -1403,7 +1403,7 @@
       <w:shd w:val="clear" w:color="auto" w:fill="F3EEF7"/>
     </w:pPr>
     <w:rPr>
-      <w:rFonts w:ascii="Palatino Linotype" w:hAnsi="Palatino Linotype" w:cs="Palatino Linotype" w:eastAsia="Palatino Linotype"/>
+      <w:rFonts w:ascii="TeX Gyre Pagella" w:hAnsi="TeX Gyre Pagella" w:cs="TeX Gyre Pagella" w:eastAsia="TeX Gyre Pagella"/>
       <w:sz w:val="19"/>
     </w:rPr>
   </w:style>
@@ -1421,7 +1421,7 @@
       <w:shd w:val="clear" w:color="auto" w:fill="E7E6E6"/>
     </w:pPr>
     <w:rPr>
-      <w:rFonts w:ascii="Palatino Linotype" w:hAnsi="Palatino Linotype" w:cs="Palatino Linotype" w:eastAsia="Palatino Linotype"/>
+      <w:rFonts w:ascii="TeX Gyre Pagella" w:hAnsi="TeX Gyre Pagella" w:cs="TeX Gyre Pagella" w:eastAsia="TeX Gyre Pagella"/>
       <w:sz w:val="18"/>
     </w:rPr>
   </w:style>
@@ -1439,7 +1439,7 @@
       <w:shd w:val="clear" w:color="auto" w:fill="E2EFD9"/>
     </w:pPr>
     <w:rPr>
-      <w:rFonts w:ascii="Palatino Linotype" w:hAnsi="Palatino Linotype" w:cs="Palatino Linotype" w:eastAsia="Palatino Linotype"/>
+      <w:rFonts w:ascii="TeX Gyre Pagella" w:hAnsi="TeX Gyre Pagella" w:cs="TeX Gyre Pagella" w:eastAsia="TeX Gyre Pagella"/>
       <w:i/>
       <w:sz w:val="22"/>
     </w:rPr>
@@ -1458,7 +1458,7 @@
       <w:shd w:val="clear" w:color="auto" w:fill="FAF9F6"/>
     </w:pPr>
     <w:rPr>
-      <w:rFonts w:ascii="Palatino Linotype" w:hAnsi="Palatino Linotype" w:cs="Palatino Linotype" w:eastAsia="Palatino Linotype"/>
+      <w:rFonts w:ascii="TeX Gyre Pagella" w:hAnsi="TeX Gyre Pagella" w:cs="TeX Gyre Pagella" w:eastAsia="TeX Gyre Pagella"/>
       <w:sz w:val="20"/>
     </w:rPr>
   </w:style>
@@ -1470,7 +1470,7 @@
       <w:jc w:val="center"/>
     </w:pPr>
     <w:rPr>
-      <w:rFonts w:ascii="Palatino Linotype" w:hAnsi="Palatino Linotype" w:cs="Palatino Linotype" w:eastAsia="Palatino Linotype"/>
+      <w:rFonts w:ascii="TeX Gyre Pagella" w:hAnsi="TeX Gyre Pagella" w:cs="TeX Gyre Pagella" w:eastAsia="TeX Gyre Pagella"/>
       <w:i/>
       <w:color w:val="3B3838"/>
       <w:sz w:val="16"/>
@@ -1493,7 +1493,7 @@
       <w:shd w:val="clear" w:color="auto" w:fill="F7F3FA"/>
     </w:pPr>
     <w:rPr>
-      <w:rFonts w:ascii="Palatino Linotype" w:hAnsi="Palatino Linotype" w:cs="Palatino Linotype" w:eastAsia="Palatino Linotype"/>
+      <w:rFonts w:ascii="TeX Gyre Pagella" w:hAnsi="TeX Gyre Pagella" w:cs="TeX Gyre Pagella" w:eastAsia="TeX Gyre Pagella"/>
       <w:color w:val="5F2987"/>
       <w:sz w:val="22"/>
     </w:rPr>
@@ -1515,7 +1515,7 @@
       <w:jc w:val="center"/>
     </w:pPr>
     <w:rPr>
-      <w:rFonts w:ascii="Palatino Linotype" w:hAnsi="Palatino Linotype" w:cs="Palatino Linotype" w:eastAsia="Palatino Linotype"/>
+      <w:rFonts w:ascii="TeX Gyre Pagella" w:hAnsi="TeX Gyre Pagella" w:cs="TeX Gyre Pagella" w:eastAsia="TeX Gyre Pagella"/>
       <w:i/>
       <w:color w:val="767171"/>
       <w:sz w:val="18"/>
@@ -1546,7 +1546,7 @@
       <w:shd w:val="clear" w:color="auto" w:fill="E2EFD9"/>
     </w:pPr>
     <w:rPr>
-      <w:rFonts w:ascii="Palatino Linotype" w:hAnsi="Palatino Linotype" w:cs="Palatino Linotype" w:eastAsia="Palatino Linotype"/>
+      <w:rFonts w:ascii="TeX Gyre Pagella" w:hAnsi="TeX Gyre Pagella" w:cs="TeX Gyre Pagella" w:eastAsia="TeX Gyre Pagella"/>
       <w:sz w:val="20"/>
     </w:rPr>
   </w:style>
@@ -1560,7 +1560,7 @@
       <w:shd w:val="clear" w:color="auto" w:fill="DDEBF7"/>
     </w:pPr>
     <w:rPr>
-      <w:rFonts w:ascii="Palatino Linotype" w:hAnsi="Palatino Linotype" w:cs="Palatino Linotype" w:eastAsia="Palatino Linotype"/>
+      <w:rFonts w:ascii="TeX Gyre Pagella" w:hAnsi="TeX Gyre Pagella" w:cs="TeX Gyre Pagella" w:eastAsia="TeX Gyre Pagella"/>
       <w:sz w:val="20"/>
     </w:rPr>
   </w:style>
@@ -1574,7 +1574,7 @@
       <w:shd w:val="clear" w:color="auto" w:fill="FBE4D5"/>
     </w:pPr>
     <w:rPr>
-      <w:rFonts w:ascii="Palatino Linotype" w:hAnsi="Palatino Linotype" w:cs="Palatino Linotype" w:eastAsia="Palatino Linotype"/>
+      <w:rFonts w:ascii="TeX Gyre Pagella" w:hAnsi="TeX Gyre Pagella" w:cs="TeX Gyre Pagella" w:eastAsia="TeX Gyre Pagella"/>
       <w:sz w:val="20"/>
     </w:rPr>
   </w:style>
@@ -1588,7 +1588,7 @@
       <w:shd w:val="clear" w:color="auto" w:fill="F3EEF7"/>
     </w:pPr>
     <w:rPr>
-      <w:rFonts w:ascii="Palatino Linotype" w:hAnsi="Palatino Linotype" w:cs="Palatino Linotype" w:eastAsia="Palatino Linotype"/>
+      <w:rFonts w:ascii="TeX Gyre Pagella" w:hAnsi="TeX Gyre Pagella" w:cs="TeX Gyre Pagella" w:eastAsia="TeX Gyre Pagella"/>
       <w:sz w:val="20"/>
     </w:rPr>
   </w:style>
@@ -1602,7 +1602,7 @@
       <w:shd w:val="clear" w:color="auto" w:fill="E7E6E6"/>
     </w:pPr>
     <w:rPr>
-      <w:rFonts w:ascii="Palatino Linotype" w:hAnsi="Palatino Linotype" w:cs="Palatino Linotype" w:eastAsia="Palatino Linotype"/>
+      <w:rFonts w:ascii="TeX Gyre Pagella" w:hAnsi="TeX Gyre Pagella" w:cs="TeX Gyre Pagella" w:eastAsia="TeX Gyre Pagella"/>
       <w:sz w:val="20"/>
     </w:rPr>
   </w:style>
@@ -1616,7 +1616,7 @@
       <w:shd w:val="clear" w:color="auto" w:fill="FAF9F6"/>
     </w:pPr>
     <w:rPr>
-      <w:rFonts w:ascii="Palatino Linotype" w:hAnsi="Palatino Linotype" w:cs="Palatino Linotype" w:eastAsia="Palatino Linotype"/>
+      <w:rFonts w:ascii="TeX Gyre Pagella" w:hAnsi="TeX Gyre Pagella" w:cs="TeX Gyre Pagella" w:eastAsia="TeX Gyre Pagella"/>
       <w:sz w:val="20"/>
     </w:rPr>
   </w:style>
@@ -1630,7 +1630,7 @@
       <w:shd w:val="clear" w:color="auto" w:fill="5F2987"/>
     </w:pPr>
     <w:rPr>
-      <w:rFonts w:ascii="Palatino Linotype" w:hAnsi="Palatino Linotype" w:cs="Palatino Linotype" w:eastAsia="Palatino Linotype"/>
+      <w:rFonts w:ascii="TeX Gyre Pagella" w:hAnsi="TeX Gyre Pagella" w:cs="TeX Gyre Pagella" w:eastAsia="TeX Gyre Pagella"/>
       <w:color w:val="FFFFFF"/>
       <w:sz w:val="20"/>
     </w:rPr>
@@ -1645,7 +1645,7 @@
       <w:shd w:val="clear" w:color="auto" w:fill="3C7D3A"/>
     </w:pPr>
     <w:rPr>
-      <w:rFonts w:ascii="Palatino Linotype" w:hAnsi="Palatino Linotype" w:cs="Palatino Linotype" w:eastAsia="Palatino Linotype"/>
+      <w:rFonts w:ascii="TeX Gyre Pagella" w:hAnsi="TeX Gyre Pagella" w:cs="TeX Gyre Pagella" w:eastAsia="TeX Gyre Pagella"/>
       <w:color w:val="FFFFFF"/>
       <w:sz w:val="20"/>
     </w:rPr>
@@ -1660,7 +1660,7 @@
       <w:shd w:val="clear" w:color="auto" w:fill="1F5F99"/>
     </w:pPr>
     <w:rPr>
-      <w:rFonts w:ascii="Palatino Linotype" w:hAnsi="Palatino Linotype" w:cs="Palatino Linotype" w:eastAsia="Palatino Linotype"/>
+      <w:rFonts w:ascii="TeX Gyre Pagella" w:hAnsi="TeX Gyre Pagella" w:cs="TeX Gyre Pagella" w:eastAsia="TeX Gyre Pagella"/>
       <w:color w:val="FFFFFF"/>
       <w:sz w:val="20"/>
     </w:rPr>
@@ -1675,7 +1675,7 @@
       <w:shd w:val="clear" w:color="auto" w:fill="B22222"/>
     </w:pPr>
     <w:rPr>
-      <w:rFonts w:ascii="Palatino Linotype" w:hAnsi="Palatino Linotype" w:cs="Palatino Linotype" w:eastAsia="Palatino Linotype"/>
+      <w:rFonts w:ascii="TeX Gyre Pagella" w:hAnsi="TeX Gyre Pagella" w:cs="TeX Gyre Pagella" w:eastAsia="TeX Gyre Pagella"/>
       <w:color w:val="FFFFFF"/>
       <w:sz w:val="20"/>
     </w:rPr>
@@ -1690,7 +1690,7 @@
       <w:shd w:val="clear" w:color="auto" w:fill="B8860B"/>
     </w:pPr>
     <w:rPr>
-      <w:rFonts w:ascii="Palatino Linotype" w:hAnsi="Palatino Linotype" w:cs="Palatino Linotype" w:eastAsia="Palatino Linotype"/>
+      <w:rFonts w:ascii="TeX Gyre Pagella" w:hAnsi="TeX Gyre Pagella" w:cs="TeX Gyre Pagella" w:eastAsia="TeX Gyre Pagella"/>
       <w:color w:val="FFFFFF"/>
       <w:sz w:val="20"/>
     </w:rPr>
@@ -1705,7 +1705,7 @@
       <w:shd w:val="clear" w:color="auto" w:fill="E07B28"/>
     </w:pPr>
     <w:rPr>
-      <w:rFonts w:ascii="Palatino Linotype" w:hAnsi="Palatino Linotype" w:cs="Palatino Linotype" w:eastAsia="Palatino Linotype"/>
+      <w:rFonts w:ascii="TeX Gyre Pagella" w:hAnsi="TeX Gyre Pagella" w:cs="TeX Gyre Pagella" w:eastAsia="TeX Gyre Pagella"/>
       <w:color w:val="FFFFFF"/>
       <w:sz w:val="20"/>
     </w:rPr>
@@ -1720,7 +1720,7 @@
       <w:shd w:val="clear" w:color="auto" w:fill="767171"/>
     </w:pPr>
     <w:rPr>
-      <w:rFonts w:ascii="Palatino Linotype" w:hAnsi="Palatino Linotype" w:cs="Palatino Linotype" w:eastAsia="Palatino Linotype"/>
+      <w:rFonts w:ascii="TeX Gyre Pagella" w:hAnsi="TeX Gyre Pagella" w:cs="TeX Gyre Pagella" w:eastAsia="TeX Gyre Pagella"/>
       <w:color w:val="FFFFFF"/>
       <w:sz w:val="20"/>
     </w:rPr>

</xml_diff>

<commit_message>
Coherencia del canon, esfuerzo bajo en el principal-agente y Word sin cajas partidas
- Pendientes de coherencia aplicados en el 3.A.8, el 3.A.11, el 3.A.13,
  el 3.A.15, el 3.A.16, el 3.A.17, el 3.A.18, el 3.A.19 y el 3.A.21 (IHH en
  escala 0-10.000, nota de B^D en el 3.A.15, remisiones y citas); el canon
  cierra las decisiones del IHH y de B^D.
- 3.A.13: el gráfico del agente averso con esfuerzo observable añade U^R
  con e^B, R, G, F y G' (capas 6-9).
- Word: cajas y títulos a la izquierda y sin partirse, enumerate anidados
  con la numeración del PDF, filas que no se parten y sombreado de celda.
- CRITERIOS: enumeraciones en viñetas y figuras pegadas a su párrafo.
- Reconstruidos los 13 temas revisados.

Co-Authored-By: Claude Opus 5.5 <noreply@anthropic.com>
Claude-Session: https://claude.ai/code/session_01PWJgAjs4PN1Rvp3aLA4tqT
</commit_message>
<xml_diff>
--- a/oposicion/temario/latex/reference.docx
+++ b/oposicion/temario/latex/reference.docx
@@ -856,6 +856,7 @@
       <w:keepNext/>
       <w:keepLines/>
       <w:spacing w:before="280" w:after="120"/>
+      <w:jc w:val="left"/>
       <w:outlineLvl w:val="0"/>
       <w:shd w:val="clear" w:color="auto" w:fill="5F2987"/>
     </w:pPr>
@@ -882,6 +883,7 @@
       <w:keepNext/>
       <w:keepLines/>
       <w:spacing w:before="240" w:after="80"/>
+      <w:jc w:val="left"/>
       <w:outlineLvl w:val="1"/>
       <w:pBdr>
         <w:bottom w:val="single" w:sz="4" w:space="1" w:color="5F2987"/>
@@ -911,6 +913,7 @@
       <w:keepLines/>
       <w:spacing w:before="160" w:after="80"/>
       <w:ind w:left="283"/>
+      <w:jc w:val="left"/>
       <w:outlineLvl w:val="2"/>
     </w:pPr>
     <w:rPr>
@@ -937,6 +940,7 @@
       <w:keepLines/>
       <w:spacing w:before="80" w:after="40"/>
       <w:ind w:left="567"/>
+      <w:jc w:val="left"/>
       <w:outlineLvl w:val="3"/>
     </w:pPr>
     <w:rPr>
@@ -963,6 +967,7 @@
       <w:keepLines/>
       <w:spacing w:before="80" w:after="40"/>
       <w:ind w:left="567"/>
+      <w:jc w:val="left"/>
       <w:outlineLvl w:val="4"/>
     </w:pPr>
     <w:rPr>
@@ -988,6 +993,7 @@
       <w:keepLines/>
       <w:spacing w:before="40" w:after="0"/>
       <w:ind w:left="567"/>
+      <w:jc w:val="left"/>
       <w:outlineLvl w:val="5"/>
     </w:pPr>
     <w:rPr>
@@ -1401,6 +1407,7 @@
         <w:left w:val="single" w:sz="24" w:space="8" w:color="5F2987"/>
       </w:pBdr>
       <w:shd w:val="clear" w:color="auto" w:fill="F3EEF7"/>
+      <w:jc w:val="left"/>
     </w:pPr>
     <w:rPr>
       <w:rFonts w:ascii="TeX Gyre Pagella" w:hAnsi="TeX Gyre Pagella" w:cs="TeX Gyre Pagella" w:eastAsia="TeX Gyre Pagella"/>
@@ -1419,6 +1426,7 @@
         <w:right w:val="single" w:sz="4" w:space="4" w:color="767171"/>
       </w:pBdr>
       <w:shd w:val="clear" w:color="auto" w:fill="E7E6E6"/>
+      <w:jc w:val="left"/>
     </w:pPr>
     <w:rPr>
       <w:rFonts w:ascii="TeX Gyre Pagella" w:hAnsi="TeX Gyre Pagella" w:cs="TeX Gyre Pagella" w:eastAsia="TeX Gyre Pagella"/>
@@ -1437,6 +1445,7 @@
         <w:right w:val="single" w:sz="4" w:space="4" w:color="C8D8C0"/>
       </w:pBdr>
       <w:shd w:val="clear" w:color="auto" w:fill="E2EFD9"/>
+      <w:jc w:val="left"/>
     </w:pPr>
     <w:rPr>
       <w:rFonts w:ascii="TeX Gyre Pagella" w:hAnsi="TeX Gyre Pagella" w:cs="TeX Gyre Pagella" w:eastAsia="TeX Gyre Pagella"/>
@@ -1456,6 +1465,7 @@
         <w:right w:val="single" w:sz="4" w:space="4" w:color="5F2987"/>
       </w:pBdr>
       <w:shd w:val="clear" w:color="auto" w:fill="FAF9F6"/>
+      <w:jc w:val="left"/>
     </w:pPr>
     <w:rPr>
       <w:rFonts w:ascii="TeX Gyre Pagella" w:hAnsi="TeX Gyre Pagella" w:cs="TeX Gyre Pagella" w:eastAsia="TeX Gyre Pagella"/>

</xml_diff>

<commit_message>
Plantillas de Word y HTML; cifras del 3.A.14 y del 3.A.22 comprobadas
Word: la cabecera de las tablas va con su primera fila (keepNext) y las
filas sombreadas con la misma letra que el resto (11 pt); HTML: el fin de
demostración se queda en su párrafo y todas las imágenes llevan texto
alternativo. Word y HTML de todos los temas revisados reconstruidos.
3.A.14: la tabla del 3G cita la tabla 1 de Klemperer (2002, EER), fila de
Alemania precisada y T-Mobil en la ronda 1 de 1999. 3.A.22: la frase de
Smith (1962) sin el excedente, que el artículo no mide.

Co-Authored-By: Claude Opus 5.5 <noreply@anthropic.com>
Claude-Session: https://claude.ai/code/session_01PWJgAjs4PN1Rvp3aLA4tqT
</commit_message>
<xml_diff>
--- a/oposicion/temario/latex/reference.docx
+++ b/oposicion/temario/latex/reference.docx
@@ -1557,7 +1557,7 @@
     </w:pPr>
     <w:rPr>
       <w:rFonts w:ascii="TeX Gyre Pagella" w:hAnsi="TeX Gyre Pagella" w:cs="TeX Gyre Pagella" w:eastAsia="TeX Gyre Pagella"/>
-      <w:sz w:val="20"/>
+      <w:sz w:val="22"/>
     </w:rPr>
   </w:style>
   <w:style w:type="paragraph" w:customStyle="1" w:styleId="Celdatceeazulpalido">
@@ -1571,7 +1571,7 @@
     </w:pPr>
     <w:rPr>
       <w:rFonts w:ascii="TeX Gyre Pagella" w:hAnsi="TeX Gyre Pagella" w:cs="TeX Gyre Pagella" w:eastAsia="TeX Gyre Pagella"/>
-      <w:sz w:val="20"/>
+      <w:sz w:val="22"/>
     </w:rPr>
   </w:style>
   <w:style w:type="paragraph" w:customStyle="1" w:styleId="Celdatceesalmon">
@@ -1585,7 +1585,7 @@
     </w:pPr>
     <w:rPr>
       <w:rFonts w:ascii="TeX Gyre Pagella" w:hAnsi="TeX Gyre Pagella" w:cs="TeX Gyre Pagella" w:eastAsia="TeX Gyre Pagella"/>
-      <w:sz w:val="20"/>
+      <w:sz w:val="22"/>
     </w:rPr>
   </w:style>
   <w:style w:type="paragraph" w:customStyle="1" w:styleId="Celdatceemoradopalido">
@@ -1599,7 +1599,7 @@
     </w:pPr>
     <w:rPr>
       <w:rFonts w:ascii="TeX Gyre Pagella" w:hAnsi="TeX Gyre Pagella" w:cs="TeX Gyre Pagella" w:eastAsia="TeX Gyre Pagella"/>
-      <w:sz w:val="20"/>
+      <w:sz w:val="22"/>
     </w:rPr>
   </w:style>
   <w:style w:type="paragraph" w:customStyle="1" w:styleId="Celdatceegrisclaro">
@@ -1613,7 +1613,7 @@
     </w:pPr>
     <w:rPr>
       <w:rFonts w:ascii="TeX Gyre Pagella" w:hAnsi="TeX Gyre Pagella" w:cs="TeX Gyre Pagella" w:eastAsia="TeX Gyre Pagella"/>
-      <w:sz w:val="20"/>
+      <w:sz w:val="22"/>
     </w:rPr>
   </w:style>
   <w:style w:type="paragraph" w:customStyle="1" w:styleId="Celdatceecrema">
@@ -1627,7 +1627,7 @@
     </w:pPr>
     <w:rPr>
       <w:rFonts w:ascii="TeX Gyre Pagella" w:hAnsi="TeX Gyre Pagella" w:cs="TeX Gyre Pagella" w:eastAsia="TeX Gyre Pagella"/>
-      <w:sz w:val="20"/>
+      <w:sz w:val="22"/>
     </w:rPr>
   </w:style>
   <w:style w:type="paragraph" w:customStyle="1" w:styleId="Celdatceemorado">
@@ -1642,7 +1642,7 @@
     <w:rPr>
       <w:rFonts w:ascii="TeX Gyre Pagella" w:hAnsi="TeX Gyre Pagella" w:cs="TeX Gyre Pagella" w:eastAsia="TeX Gyre Pagella"/>
       <w:color w:val="FFFFFF"/>
-      <w:sz w:val="20"/>
+      <w:sz w:val="22"/>
     </w:rPr>
   </w:style>
   <w:style w:type="paragraph" w:customStyle="1" w:styleId="Celdatceeverde">
@@ -1657,7 +1657,7 @@
     <w:rPr>
       <w:rFonts w:ascii="TeX Gyre Pagella" w:hAnsi="TeX Gyre Pagella" w:cs="TeX Gyre Pagella" w:eastAsia="TeX Gyre Pagella"/>
       <w:color w:val="FFFFFF"/>
-      <w:sz w:val="20"/>
+      <w:sz w:val="22"/>
     </w:rPr>
   </w:style>
   <w:style w:type="paragraph" w:customStyle="1" w:styleId="Celdatceeazul">
@@ -1672,7 +1672,7 @@
     <w:rPr>
       <w:rFonts w:ascii="TeX Gyre Pagella" w:hAnsi="TeX Gyre Pagella" w:cs="TeX Gyre Pagella" w:eastAsia="TeX Gyre Pagella"/>
       <w:color w:val="FFFFFF"/>
-      <w:sz w:val="20"/>
+      <w:sz w:val="22"/>
     </w:rPr>
   </w:style>
   <w:style w:type="paragraph" w:customStyle="1" w:styleId="Celdatceerojo">
@@ -1687,7 +1687,7 @@
     <w:rPr>
       <w:rFonts w:ascii="TeX Gyre Pagella" w:hAnsi="TeX Gyre Pagella" w:cs="TeX Gyre Pagella" w:eastAsia="TeX Gyre Pagella"/>
       <w:color w:val="FFFFFF"/>
-      <w:sz w:val="20"/>
+      <w:sz w:val="22"/>
     </w:rPr>
   </w:style>
   <w:style w:type="paragraph" w:customStyle="1" w:styleId="Celdatceedorado">
@@ -1702,7 +1702,7 @@
     <w:rPr>
       <w:rFonts w:ascii="TeX Gyre Pagella" w:hAnsi="TeX Gyre Pagella" w:cs="TeX Gyre Pagella" w:eastAsia="TeX Gyre Pagella"/>
       <w:color w:val="FFFFFF"/>
-      <w:sz w:val="20"/>
+      <w:sz w:val="22"/>
     </w:rPr>
   </w:style>
   <w:style w:type="paragraph" w:customStyle="1" w:styleId="Celdatceenaranja">
@@ -1717,7 +1717,7 @@
     <w:rPr>
       <w:rFonts w:ascii="TeX Gyre Pagella" w:hAnsi="TeX Gyre Pagella" w:cs="TeX Gyre Pagella" w:eastAsia="TeX Gyre Pagella"/>
       <w:color w:val="FFFFFF"/>
-      <w:sz w:val="20"/>
+      <w:sz w:val="22"/>
     </w:rPr>
   </w:style>
   <w:style w:type="paragraph" w:customStyle="1" w:styleId="Celdatceegris">
@@ -1732,7 +1732,7 @@
     <w:rPr>
       <w:rFonts w:ascii="TeX Gyre Pagella" w:hAnsi="TeX Gyre Pagella" w:cs="TeX Gyre Pagella" w:eastAsia="TeX Gyre Pagella"/>
       <w:color w:val="FFFFFF"/>
-      <w:sz w:val="20"/>
+      <w:sz w:val="22"/>
     </w:rPr>
   </w:style>
   <w:style w:type="character" w:customStyle="1" w:styleId="Textomorado">

</xml_diff>